<commit_message>
docs(release): v1.1.0 CHANGELOG + full user guide/manual + HTML/PDF/DOCX exports
- CHANGELOG.md (v1.1.0 + v1.0.0) with HTML/PDF/DOCX.
- Provider Aliases User Guide: +remote deployment & heavy-testing section,
  +command quick-reference (11 sections); re-exported all formats.
- Re-exported README + long-form doc (purple + provider content) to all formats.

Co-Authored-By: Claude Opus 4.8 <noreply@anthropic.com>
</commit_message>
<xml_diff>
--- a/docs/Provider_Aliases_User_Guide.docx
+++ b/docs/Provider_Aliases_User_Guide.docx
@@ -36,7 +36,7 @@
         </w:p>
       </w:sdtContent>
     </w:sdt>
-    <w:bookmarkStart w:id="21" w:name="provider-aliases--user-guide"/>
+    <w:bookmarkStart w:id="23" w:name="provider-aliases--user-guide"/>
     <w:p>
       <w:pPr>
         <w:pStyle w:val="Heading1"/>
@@ -2354,7 +2354,7 @@
           <w:b/>
           <w:bCs/>
         </w:rPr>
-        <w:t xml:space="preserve">orange</w:t>
+        <w:t xml:space="preserve">purple</w:t>
       </w:r>
       <w:r>
         <w:t xml:space="preserve">. Investigation of the installed Claude Code (v2.1.178) found that</w:t>
@@ -2424,7 +2424,7 @@
         <w:rPr>
           <w:rStyle w:val="VerbatimChar"/>
         </w:rPr>
-        <w:t xml:space="preserve">/color orange</w:t>
+        <w:t xml:space="preserve">/color purple</w:t>
       </w:r>
       <w:r>
         <w:t xml:space="preserve"> </w:t>
@@ -2439,7 +2439,7 @@
         <w:rPr>
           <w:rStyle w:val="VerbatimChar"/>
         </w:rPr>
-        <w:t xml:space="preserve">orange</w:t>
+        <w:t xml:space="preserve">purple</w:t>
       </w:r>
       <w:r>
         <w:t xml:space="preserve"> </w:t>
@@ -2743,7 +2743,798 @@
       </w:tr>
     </w:tbl>
     <w:bookmarkEnd w:id="20"/>
+    <w:bookmarkStart w:id="21" w:name="X3a8cfb3df08f1b01d4104cee554ee54e958c822"/>
+    <w:p>
+      <w:pPr>
+        <w:pStyle w:val="Heading2"/>
+      </w:pPr>
+      <w:r>
+        <w:t xml:space="preserve">10. Remote distributed deployment &amp; heavy testing</w:t>
+      </w:r>
+    </w:p>
+    <w:p>
+      <w:pPr>
+        <w:pStyle w:val="FirstParagraph"/>
+      </w:pPr>
+      <w:r>
+        <w:t xml:space="preserve">For heavy testing that depends on</w:t>
+      </w:r>
+      <w:r>
+        <w:t xml:space="preserve"> </w:t>
+      </w:r>
+      <w:r>
+        <w:rPr>
+          <w:b/>
+          <w:bCs/>
+        </w:rPr>
+        <w:t xml:space="preserve">real production services</w:t>
+      </w:r>
+      <w:r>
+        <w:t xml:space="preserve">, the toolkit can</w:t>
+      </w:r>
+      <w:r>
+        <w:t xml:space="preserve"> </w:t>
+      </w:r>
+      <w:r>
+        <w:t xml:space="preserve">boot the full LLMsVerifier System on a remote host (registered in</w:t>
+      </w:r>
+      <w:r>
+        <w:t xml:space="preserve"> </w:t>
+      </w:r>
+      <w:r>
+        <w:rPr>
+          <w:rStyle w:val="VerbatimChar"/>
+        </w:rPr>
+        <w:t xml:space="preserve">config/containers/nezha.env</w:t>
+      </w:r>
+      <w:r>
+        <w:t xml:space="preserve">) via the</w:t>
+      </w:r>
+      <w:r>
+        <w:t xml:space="preserve"> </w:t>
+      </w:r>
+      <w:r>
+        <w:rPr>
+          <w:rStyle w:val="VerbatimChar"/>
+        </w:rPr>
+        <w:t xml:space="preserve">containers</w:t>
+      </w:r>
+      <w:r>
+        <w:t xml:space="preserve"> </w:t>
+      </w:r>
+      <w:r>
+        <w:t xml:space="preserve">submodule + podman, and run</w:t>
+      </w:r>
+      <w:r>
+        <w:t xml:space="preserve"> </w:t>
+      </w:r>
+      <w:r>
+        <w:t xml:space="preserve">real per-provider verification through it.</w:t>
+      </w:r>
+    </w:p>
+    <w:p>
+      <w:pPr>
+        <w:pStyle w:val="Compact"/>
+        <w:numPr>
+          <w:ilvl w:val="0"/>
+          <w:numId w:val="1004"/>
+        </w:numPr>
+      </w:pPr>
+      <w:r>
+        <w:rPr>
+          <w:b/>
+          <w:bCs/>
+        </w:rPr>
+        <w:t xml:space="preserve">Deployment guide + boot procedure:</w:t>
+      </w:r>
+      <w:r>
+        <w:t xml:space="preserve"> </w:t>
+      </w:r>
+      <w:r>
+        <w:rPr>
+          <w:rStyle w:val="VerbatimChar"/>
+        </w:rPr>
+        <w:t xml:space="preserve">config/containers/llmsverifier/README.md</w:t>
+      </w:r>
+      <w:r>
+        <w:t xml:space="preserve"> </w:t>
+      </w:r>
+      <w:r>
+        <w:t xml:space="preserve">(services, ports, the exact</w:t>
+      </w:r>
+      <w:r>
+        <w:t xml:space="preserve"> </w:t>
+      </w:r>
+      <w:r>
+        <w:rPr>
+          <w:rStyle w:val="VerbatimChar"/>
+        </w:rPr>
+        <w:t xml:space="preserve">podman-compose</w:t>
+      </w:r>
+      <w:r>
+        <w:t xml:space="preserve"> </w:t>
+      </w:r>
+      <w:r>
+        <w:t xml:space="preserve">boot steps, and every</w:t>
+      </w:r>
+      <w:r>
+        <w:t xml:space="preserve"> </w:t>
+      </w:r>
+      <w:r>
+        <w:t xml:space="preserve">root-caused deployment fix).</w:t>
+      </w:r>
+    </w:p>
+    <w:p>
+      <w:pPr>
+        <w:pStyle w:val="Compact"/>
+        <w:numPr>
+          <w:ilvl w:val="0"/>
+          <w:numId w:val="1004"/>
+        </w:numPr>
+      </w:pPr>
+      <w:r>
+        <w:rPr>
+          <w:b/>
+          <w:bCs/>
+        </w:rPr>
+        <w:t xml:space="preserve">What runs:</w:t>
+      </w:r>
+      <w:r>
+        <w:t xml:space="preserve"> </w:t>
+      </w:r>
+      <w:r>
+        <w:t xml:space="preserve">the</w:t>
+      </w:r>
+      <w:r>
+        <w:t xml:space="preserve"> </w:t>
+      </w:r>
+      <w:r>
+        <w:rPr>
+          <w:rStyle w:val="VerbatimChar"/>
+        </w:rPr>
+        <w:t xml:space="preserve">llm-verifier</w:t>
+      </w:r>
+      <w:r>
+        <w:t xml:space="preserve"> </w:t>
+      </w:r>
+      <w:r>
+        <w:t xml:space="preserve">API + an observability tier (prometheus +</w:t>
+      </w:r>
+      <w:r>
+        <w:t xml:space="preserve"> </w:t>
+      </w:r>
+      <w:r>
+        <w:t xml:space="preserve">grafana with an auto-provisioned datasource &amp; dashboard + node-exporter).</w:t>
+      </w:r>
+    </w:p>
+    <w:p>
+      <w:pPr>
+        <w:pStyle w:val="Compact"/>
+        <w:numPr>
+          <w:ilvl w:val="0"/>
+          <w:numId w:val="1004"/>
+        </w:numPr>
+      </w:pPr>
+      <w:r>
+        <w:rPr>
+          <w:b/>
+          <w:bCs/>
+        </w:rPr>
+        <w:t xml:space="preserve">Heavy testing:</w:t>
+      </w:r>
+      <w:r>
+        <w:t xml:space="preserve"> </w:t>
+      </w:r>
+      <w:r>
+        <w:t xml:space="preserve">the bundled</w:t>
+      </w:r>
+      <w:r>
+        <w:t xml:space="preserve"> </w:t>
+      </w:r>
+      <w:r>
+        <w:rPr>
+          <w:rStyle w:val="VerbatimChar"/>
+        </w:rPr>
+        <w:t xml:space="preserve">model-verification</w:t>
+      </w:r>
+      <w:r>
+        <w:t xml:space="preserve"> </w:t>
+      </w:r>
+      <w:r>
+        <w:t xml:space="preserve">tool runs a real</w:t>
+      </w:r>
+      <w:r>
+        <w:t xml:space="preserve"> </w:t>
+      </w:r>
+      <w:r>
+        <w:t xml:space="preserve">"Do you see my code?" check against each provider's live API:</w:t>
+      </w:r>
+    </w:p>
+    <w:p>
+      <w:pPr>
+        <w:pStyle w:val="SourceCode"/>
+        <w:numPr>
+          <w:ilvl w:val="0"/>
+          <w:numId w:val="1000"/>
+        </w:numPr>
+      </w:pPr>
+      <w:r>
+        <w:rPr>
+          <w:rStyle w:val="FunctionTok"/>
+        </w:rPr>
+        <w:t xml:space="preserve">ssh</w:t>
+      </w:r>
+      <w:r>
+        <w:rPr>
+          <w:rStyle w:val="NormalTok"/>
+        </w:rPr>
+        <w:t xml:space="preserve"> </w:t>
+      </w:r>
+      <w:r>
+        <w:rPr>
+          <w:rStyle w:val="OperatorTok"/>
+        </w:rPr>
+        <w:t xml:space="preserve">&lt;</w:t>
+      </w:r>
+      <w:r>
+        <w:rPr>
+          <w:rStyle w:val="NormalTok"/>
+        </w:rPr>
+        <w:t xml:space="preserve">user</w:t>
+      </w:r>
+      <w:r>
+        <w:rPr>
+          <w:rStyle w:val="OperatorTok"/>
+        </w:rPr>
+        <w:t xml:space="preserve">&gt;</w:t>
+      </w:r>
+      <w:r>
+        <w:rPr>
+          <w:rStyle w:val="NormalTok"/>
+        </w:rPr>
+        <w:t xml:space="preserve">@</w:t>
+      </w:r>
+      <w:r>
+        <w:rPr>
+          <w:rStyle w:val="OperatorTok"/>
+        </w:rPr>
+        <w:t xml:space="preserve">&lt;</w:t>
+      </w:r>
+      <w:r>
+        <w:rPr>
+          <w:rStyle w:val="NormalTok"/>
+        </w:rPr>
+        <w:t xml:space="preserve">host</w:t>
+      </w:r>
+      <w:r>
+        <w:rPr>
+          <w:rStyle w:val="OperatorTok"/>
+        </w:rPr>
+        <w:t xml:space="preserve">&gt;</w:t>
+      </w:r>
+      <w:r>
+        <w:rPr>
+          <w:rStyle w:val="NormalTok"/>
+        </w:rPr>
+        <w:t xml:space="preserve"> </w:t>
+      </w:r>
+      <w:r>
+        <w:rPr>
+          <w:rStyle w:val="StringTok"/>
+        </w:rPr>
+        <w:t xml:space="preserve">'podman run --rm --env-file ~/helix-system/llmsverifier/.env \</w:t>
+      </w:r>
+      <w:r>
+        <w:br/>
+      </w:r>
+      <w:r>
+        <w:rPr>
+          <w:rStyle w:val="StringTok"/>
+        </w:rPr>
+        <w:t xml:space="preserve">  llm-verifier-mv:nezha --provider deepseek --model deepseek-chat --verbose'</w:t>
+      </w:r>
+    </w:p>
+    <w:p>
+      <w:pPr>
+        <w:pStyle w:val="Compact"/>
+        <w:numPr>
+          <w:ilvl w:val="0"/>
+          <w:numId w:val="1004"/>
+        </w:numPr>
+      </w:pPr>
+      <w:r>
+        <w:rPr>
+          <w:b/>
+          <w:bCs/>
+        </w:rPr>
+        <w:t xml:space="preserve">Evidence:</w:t>
+      </w:r>
+      <w:r>
+        <w:t xml:space="preserve"> </w:t>
+      </w:r>
+      <w:r>
+        <w:t xml:space="preserve">every verification + deployment claim is captured under</w:t>
+      </w:r>
+      <w:r>
+        <w:t xml:space="preserve"> </w:t>
+      </w:r>
+      <w:r>
+        <w:rPr>
+          <w:rStyle w:val="VerbatimChar"/>
+        </w:rPr>
+        <w:t xml:space="preserve">docs/qa/20260616-infra/</w:t>
+      </w:r>
+      <w:r>
+        <w:t xml:space="preserve"> </w:t>
+      </w:r>
+      <w:r>
+        <w:t xml:space="preserve">(proofs, sweeps, security, observability).</w:t>
+      </w:r>
+    </w:p>
     <w:bookmarkEnd w:id="21"/>
+    <w:bookmarkStart w:id="22" w:name="X5adce624c539e5a56b0ecfb231efcdd5fa14448"/>
+    <w:p>
+      <w:pPr>
+        <w:pStyle w:val="Heading2"/>
+      </w:pPr>
+      <w:r>
+        <w:t xml:space="preserve">11. Command quick-reference</w:t>
+      </w:r>
+    </w:p>
+    <w:p>
+      <w:pPr>
+        <w:pStyle w:val="SourceCode"/>
+      </w:pPr>
+      <w:r>
+        <w:rPr>
+          <w:rStyle w:val="CommentTok"/>
+        </w:rPr>
+        <w:t xml:space="preserve"># Provider aliases</w:t>
+      </w:r>
+      <w:r>
+        <w:br/>
+      </w:r>
+      <w:r>
+        <w:rPr>
+          <w:rStyle w:val="ExtensionTok"/>
+        </w:rPr>
+        <w:t xml:space="preserve">claude-providers</w:t>
+      </w:r>
+      <w:r>
+        <w:rPr>
+          <w:rStyle w:val="NormalTok"/>
+        </w:rPr>
+        <w:t xml:space="preserve"> sync                 </w:t>
+      </w:r>
+      <w:r>
+        <w:rPr>
+          <w:rStyle w:val="CommentTok"/>
+        </w:rPr>
+        <w:t xml:space="preserve"># discover keys -&gt; create/refresh aliases</w:t>
+      </w:r>
+      <w:r>
+        <w:br/>
+      </w:r>
+      <w:r>
+        <w:rPr>
+          <w:rStyle w:val="ExtensionTok"/>
+        </w:rPr>
+        <w:t xml:space="preserve">claude-providers</w:t>
+      </w:r>
+      <w:r>
+        <w:rPr>
+          <w:rStyle w:val="NormalTok"/>
+        </w:rPr>
+        <w:t xml:space="preserve"> sync </w:t>
+      </w:r>
+      <w:r>
+        <w:rPr>
+          <w:rStyle w:val="AttributeTok"/>
+        </w:rPr>
+        <w:t xml:space="preserve">--no-verify</w:t>
+      </w:r>
+      <w:r>
+        <w:rPr>
+          <w:rStyle w:val="NormalTok"/>
+        </w:rPr>
+        <w:t xml:space="preserve">     </w:t>
+      </w:r>
+      <w:r>
+        <w:rPr>
+          <w:rStyle w:val="CommentTok"/>
+        </w:rPr>
+        <w:t xml:space="preserve"># skip verification (faster)</w:t>
+      </w:r>
+      <w:r>
+        <w:br/>
+      </w:r>
+      <w:r>
+        <w:rPr>
+          <w:rStyle w:val="ExtensionTok"/>
+        </w:rPr>
+        <w:t xml:space="preserve">claude-providers</w:t>
+      </w:r>
+      <w:r>
+        <w:rPr>
+          <w:rStyle w:val="NormalTok"/>
+        </w:rPr>
+        <w:t xml:space="preserve"> list                 </w:t>
+      </w:r>
+      <w:r>
+        <w:rPr>
+          <w:rStyle w:val="CommentTok"/>
+        </w:rPr>
+        <w:t xml:space="preserve"># alias | provider | transport | models</w:t>
+      </w:r>
+      <w:r>
+        <w:br/>
+      </w:r>
+      <w:r>
+        <w:rPr>
+          <w:rStyle w:val="ExtensionTok"/>
+        </w:rPr>
+        <w:t xml:space="preserve">claude-providers</w:t>
+      </w:r>
+      <w:r>
+        <w:rPr>
+          <w:rStyle w:val="NormalTok"/>
+        </w:rPr>
+        <w:t xml:space="preserve"> show </w:t>
+      </w:r>
+      <w:r>
+        <w:rPr>
+          <w:rStyle w:val="OperatorTok"/>
+        </w:rPr>
+        <w:t xml:space="preserve">&lt;</w:t>
+      </w:r>
+      <w:r>
+        <w:rPr>
+          <w:rStyle w:val="NormalTok"/>
+        </w:rPr>
+        <w:t xml:space="preserve">id</w:t>
+      </w:r>
+      <w:r>
+        <w:rPr>
+          <w:rStyle w:val="OperatorTok"/>
+        </w:rPr>
+        <w:t xml:space="preserve">&gt;</w:t>
+      </w:r>
+      <w:r>
+        <w:rPr>
+          <w:rStyle w:val="NormalTok"/>
+        </w:rPr>
+        <w:t xml:space="preserve">            </w:t>
+      </w:r>
+      <w:r>
+        <w:rPr>
+          <w:rStyle w:val="CommentTok"/>
+        </w:rPr>
+        <w:t xml:space="preserve"># one provider's resolved env</w:t>
+      </w:r>
+      <w:r>
+        <w:br/>
+      </w:r>
+      <w:r>
+        <w:rPr>
+          <w:rStyle w:val="ExtensionTok"/>
+        </w:rPr>
+        <w:t xml:space="preserve">claude-providers</w:t>
+      </w:r>
+      <w:r>
+        <w:rPr>
+          <w:rStyle w:val="NormalTok"/>
+        </w:rPr>
+        <w:t xml:space="preserve"> remove </w:t>
+      </w:r>
+      <w:r>
+        <w:rPr>
+          <w:rStyle w:val="OperatorTok"/>
+        </w:rPr>
+        <w:t xml:space="preserve">&lt;</w:t>
+      </w:r>
+      <w:r>
+        <w:rPr>
+          <w:rStyle w:val="NormalTok"/>
+        </w:rPr>
+        <w:t xml:space="preserve">id</w:t>
+      </w:r>
+      <w:r>
+        <w:rPr>
+          <w:rStyle w:val="OperatorTok"/>
+        </w:rPr>
+        <w:t xml:space="preserve">&gt;</w:t>
+      </w:r>
+      <w:r>
+        <w:rPr>
+          <w:rStyle w:val="NormalTok"/>
+        </w:rPr>
+        <w:t xml:space="preserve">          </w:t>
+      </w:r>
+      <w:r>
+        <w:rPr>
+          <w:rStyle w:val="CommentTok"/>
+        </w:rPr>
+        <w:t xml:space="preserve"># remove alias + env, back up config dir</w:t>
+      </w:r>
+      <w:r>
+        <w:br/>
+      </w:r>
+      <w:r>
+        <w:rPr>
+          <w:rStyle w:val="ExtensionTok"/>
+        </w:rPr>
+        <w:t xml:space="preserve">claude-providers</w:t>
+      </w:r>
+      <w:r>
+        <w:rPr>
+          <w:rStyle w:val="NormalTok"/>
+        </w:rPr>
+        <w:t xml:space="preserve"> add </w:t>
+      </w:r>
+      <w:r>
+        <w:rPr>
+          <w:rStyle w:val="AttributeTok"/>
+        </w:rPr>
+        <w:t xml:space="preserve">--from-key</w:t>
+      </w:r>
+      <w:r>
+        <w:rPr>
+          <w:rStyle w:val="NormalTok"/>
+        </w:rPr>
+        <w:t xml:space="preserve"> VAR </w:t>
+      </w:r>
+      <w:r>
+        <w:rPr>
+          <w:rStyle w:val="AttributeTok"/>
+        </w:rPr>
+        <w:t xml:space="preserve">--id</w:t>
+      </w:r>
+      <w:r>
+        <w:rPr>
+          <w:rStyle w:val="NormalTok"/>
+        </w:rPr>
+        <w:t xml:space="preserve"> PROVIDER   </w:t>
+      </w:r>
+      <w:r>
+        <w:rPr>
+          <w:rStyle w:val="CommentTok"/>
+        </w:rPr>
+        <w:t xml:space="preserve"># register mapping + sync</w:t>
+      </w:r>
+      <w:r>
+        <w:br/>
+      </w:r>
+      <w:r>
+        <w:br/>
+      </w:r>
+      <w:r>
+        <w:rPr>
+          <w:rStyle w:val="CommentTok"/>
+        </w:rPr>
+        <w:t xml:space="preserve"># Launch a provider session (after: source the alias file or open a new shell)</w:t>
+      </w:r>
+      <w:r>
+        <w:br/>
+      </w:r>
+      <w:r>
+        <w:rPr>
+          <w:rStyle w:val="ExtensionTok"/>
+        </w:rPr>
+        <w:t xml:space="preserve">deepseek</w:t>
+      </w:r>
+      <w:r>
+        <w:rPr>
+          <w:rStyle w:val="NormalTok"/>
+        </w:rPr>
+        <w:t xml:space="preserve">                              </w:t>
+      </w:r>
+      <w:r>
+        <w:rPr>
+          <w:rStyle w:val="CommentTok"/>
+        </w:rPr>
+        <w:t xml:space="preserve"># native provider -&gt; claude</w:t>
+      </w:r>
+      <w:r>
+        <w:br/>
+      </w:r>
+      <w:r>
+        <w:rPr>
+          <w:rStyle w:val="OperatorTok"/>
+        </w:rPr>
+        <w:t xml:space="preserve">&lt;</w:t>
+      </w:r>
+      <w:r>
+        <w:rPr>
+          <w:rStyle w:val="NormalTok"/>
+        </w:rPr>
+        <w:t xml:space="preserve">router-provider</w:t>
+      </w:r>
+      <w:r>
+        <w:rPr>
+          <w:rStyle w:val="OperatorTok"/>
+        </w:rPr>
+        <w:t xml:space="preserve">&gt;</w:t>
+      </w:r>
+      <w:r>
+        <w:rPr>
+          <w:rStyle w:val="NormalTok"/>
+        </w:rPr>
+        <w:t xml:space="preserve">                     </w:t>
+      </w:r>
+      <w:r>
+        <w:rPr>
+          <w:rStyle w:val="CommentTok"/>
+        </w:rPr>
+        <w:t xml:space="preserve"># routed provider -&gt; claude via ccr</w:t>
+      </w:r>
+      <w:r>
+        <w:br/>
+      </w:r>
+      <w:r>
+        <w:rPr>
+          <w:rStyle w:val="ExtensionTok"/>
+        </w:rPr>
+        <w:t xml:space="preserve">deepseek</w:t>
+      </w:r>
+      <w:r>
+        <w:rPr>
+          <w:rStyle w:val="NormalTok"/>
+        </w:rPr>
+        <w:t xml:space="preserve"> </w:t>
+      </w:r>
+      <w:r>
+        <w:rPr>
+          <w:rStyle w:val="AttributeTok"/>
+        </w:rPr>
+        <w:t xml:space="preserve">-p</w:t>
+      </w:r>
+      <w:r>
+        <w:rPr>
+          <w:rStyle w:val="NormalTok"/>
+        </w:rPr>
+        <w:t xml:space="preserve"> </w:t>
+      </w:r>
+      <w:r>
+        <w:rPr>
+          <w:rStyle w:val="StringTok"/>
+        </w:rPr>
+        <w:t xml:space="preserve">"your prompt"</w:t>
+      </w:r>
+      <w:r>
+        <w:rPr>
+          <w:rStyle w:val="NormalTok"/>
+        </w:rPr>
+        <w:t xml:space="preserve">             </w:t>
+      </w:r>
+      <w:r>
+        <w:rPr>
+          <w:rStyle w:val="CommentTok"/>
+        </w:rPr>
+        <w:t xml:space="preserve"># non-interactive print mode</w:t>
+      </w:r>
+      <w:r>
+        <w:br/>
+      </w:r>
+      <w:r>
+        <w:br/>
+      </w:r>
+      <w:r>
+        <w:rPr>
+          <w:rStyle w:val="CommentTok"/>
+        </w:rPr>
+        <w:t xml:space="preserve"># Accounts (unchanged, still works)</w:t>
+      </w:r>
+      <w:r>
+        <w:br/>
+      </w:r>
+      <w:r>
+        <w:rPr>
+          <w:rStyle w:val="ExtensionTok"/>
+        </w:rPr>
+        <w:t xml:space="preserve">claude-add-account</w:t>
+      </w:r>
+      <w:r>
+        <w:rPr>
+          <w:rStyle w:val="NormalTok"/>
+        </w:rPr>
+        <w:t xml:space="preserve"> </w:t>
+      </w:r>
+      <w:r>
+        <w:rPr>
+          <w:rStyle w:val="AttributeTok"/>
+        </w:rPr>
+        <w:t xml:space="preserve">--alias</w:t>
+      </w:r>
+      <w:r>
+        <w:rPr>
+          <w:rStyle w:val="NormalTok"/>
+        </w:rPr>
+        <w:t xml:space="preserve"> claudeN    </w:t>
+      </w:r>
+      <w:r>
+        <w:rPr>
+          <w:rStyle w:val="CommentTok"/>
+        </w:rPr>
+        <w:t xml:space="preserve"># add a Claude account</w:t>
+      </w:r>
+      <w:r>
+        <w:br/>
+      </w:r>
+      <w:r>
+        <w:rPr>
+          <w:rStyle w:val="ExtensionTok"/>
+        </w:rPr>
+        <w:t xml:space="preserve">claude-list-accounts</w:t>
+      </w:r>
+      <w:r>
+        <w:rPr>
+          <w:rStyle w:val="NormalTok"/>
+        </w:rPr>
+        <w:t xml:space="preserve">                  </w:t>
+      </w:r>
+      <w:r>
+        <w:rPr>
+          <w:rStyle w:val="CommentTok"/>
+        </w:rPr>
+        <w:t xml:space="preserve"># status of all accounts</w:t>
+      </w:r>
+      <w:r>
+        <w:br/>
+      </w:r>
+      <w:r>
+        <w:rPr>
+          <w:rStyle w:val="ExtensionTok"/>
+        </w:rPr>
+        <w:t xml:space="preserve">claude-unify</w:t>
+      </w:r>
+      <w:r>
+        <w:rPr>
+          <w:rStyle w:val="NormalTok"/>
+        </w:rPr>
+        <w:t xml:space="preserve">                          </w:t>
+      </w:r>
+      <w:r>
+        <w:rPr>
+          <w:rStyle w:val="CommentTok"/>
+        </w:rPr>
+        <w:t xml:space="preserve"># re-merge shared state</w:t>
+      </w:r>
+      <w:r>
+        <w:br/>
+      </w:r>
+      <w:r>
+        <w:br/>
+      </w:r>
+      <w:r>
+        <w:rPr>
+          <w:rStyle w:val="CommentTok"/>
+        </w:rPr>
+        <w:t xml:space="preserve"># Docs</w:t>
+      </w:r>
+      <w:r>
+        <w:br/>
+      </w:r>
+      <w:r>
+        <w:rPr>
+          <w:rStyle w:val="ExtensionTok"/>
+        </w:rPr>
+        <w:t xml:space="preserve">claude-export-docs</w:t>
+      </w:r>
+      <w:r>
+        <w:rPr>
+          <w:rStyle w:val="NormalTok"/>
+        </w:rPr>
+        <w:t xml:space="preserve">                    </w:t>
+      </w:r>
+      <w:r>
+        <w:rPr>
+          <w:rStyle w:val="CommentTok"/>
+        </w:rPr>
+        <w:t xml:space="preserve"># regenerate HTML/PDF/DOCX</w:t>
+      </w:r>
+    </w:p>
+    <w:bookmarkEnd w:id="22"/>
+    <w:bookmarkEnd w:id="23"/>
     <w:sectPr>
       <w:footnotePr>
         <w:numRestart w:val="eachSect"/>
@@ -2967,6 +3758,9 @@
     <w:abstractNumId w:val="991"/>
   </w:num>
   <w:num w:numId="1003">
+    <w:abstractNumId w:val="991"/>
+  </w:num>
+  <w:num w:numId="1004">
     <w:abstractNumId w:val="991"/>
   </w:num>
 </w:numbering>

</xml_diff>